<commit_message>
Update book data from updated docx analyses
</commit_message>
<xml_diff>
--- a/rozbory_andy/Autoři/Coelho, Paulo/Alchymista.docx
+++ b/rozbory_andy/Autoři/Coelho, Paulo/Alchymista.docx
@@ -41,6 +41,12 @@
       </w:r>
     </w:p>
     <w:p>
+      <w:pPr>
+        <w:rPr>
+          <w:b/>
+          <w:bCs/>
+        </w:rPr>
+      </w:pPr>
       <w:r>
         <w:rPr>
           <w:b/>
@@ -55,17 +61,39 @@
         </w:rPr>
         <w:t xml:space="preserve"> </w:t>
       </w:r>
-      <w:r>
+    </w:p>
+    <w:p>
+      <w:pPr>
+        <w:pStyle w:val="Odstavecseseznamem"/>
+        <w:numPr>
+          <w:ilvl w:val="0"/>
+          <w:numId w:val="2"/>
+        </w:numPr>
+      </w:pPr>
+      <w:r>
+        <w:rPr>
+          <w:b/>
+          <w:bCs/>
+        </w:rPr>
         <w:t>Magický Realismus</w:t>
       </w:r>
       <w:r>
         <w:t xml:space="preserve"> </w:t>
       </w:r>
       <w:r>
-        <w:t>(2 světy, nadpřirozený a reálný, nereálně věci</w:t>
-      </w:r>
-      <w:r>
-        <w:t>, jsou vnímány do reality</w:t>
+        <w:t>(</w:t>
+      </w:r>
+      <w:r>
+        <w:t xml:space="preserve">Je to prolínání každodenní reality s nadpřirozenými prvky, které postavy vnímají a přijímají jako přirozenou součást života. </w:t>
+      </w:r>
+      <w:r>
+        <w:t>[</w:t>
+      </w:r>
+      <w:r>
+        <w:t>Santiago mluví s větrem, se sluncem nebo s rukou, která „vše napsala“. Tyto entity mu odpovídají a nikdo se nad tím nepozastavuje jako nad zázrakem – je to prostě součást cesty.</w:t>
+      </w:r>
+      <w:r>
+        <w:t>]</w:t>
       </w:r>
       <w:r>
         <w:t>)</w:t>
@@ -415,16 +443,24 @@
       </w:r>
       <w:proofErr w:type="spellEnd"/>
       <w:r>
-        <w:t xml:space="preserve"> králem se rozhodne své stádo prodat a vydat se do Afriky k pyramidám přesně podle svého snu. …- Trčím tu mezi ovcemi a pokladem,- napadlo ho. Musí se rozhodnout mezi tím, na co si zvykl, a tím, co by rád měl…Pastýř začal větru závidět jeho svobodu a uvědomil si, že i on ji může mít. Nic mu nebrání, jen on sám. Ovce, kupcova dcera i andaluské pláně jsou jen stupně v jeho Osobním příběhu.</w:t>
-      </w:r>
-    </w:p>
-    <w:p>
-      <w:r>
-        <w:t xml:space="preserve">Jenže těsně po svém příjezdu do cizí a neznámé země je okraden o všechny peníze. Nezbývá mu tedy nic jiného než sehnat si nějakou práci. Zkouší to u prodavače skla. Den co den u něj leští sklenice, až ho napadne, že by v nich mohli kolemjdoucím podávat osvěžující čaj. Nejen že by tím lidi přilákali, ale navíc by si lidé jistě všimli, jak krásně čaj ve skle vypadá a sklenáři by to </w:t>
+        <w:t xml:space="preserve"> králem se rozhodne své stádo prodat a vydat se do Afriky k pyramidám přesně podle svého snu. Musí se rozhodnout mezi tím, na co si zvykl, a tím, co by rád měl…Pastýř začal větru závidět jeho svobodu a uvědomil si, že i on ji může mít. Nic mu nebrání, jen on sám. Ovce, kupcova dcera i andaluské pláně jsou jen stupně v jeho Osobním příběhu.</w:t>
+      </w:r>
+    </w:p>
+    <w:p>
+      <w:r>
+        <w:t xml:space="preserve">Jenže těsně po svém příjezdu do cizí a neznámé země je okraden o všechny peníze. Nezbývá mu tedy nic jiného než sehnat si nějakou práci. Zkouší to u prodavače skla. </w:t>
+      </w:r>
+      <w:proofErr w:type="gramStart"/>
+      <w:r>
+        <w:t>Den</w:t>
+      </w:r>
+      <w:proofErr w:type="gramEnd"/>
+      <w:r>
+        <w:t xml:space="preserve"> co den u něj leští </w:t>
       </w:r>
       <w:r>
         <w:lastRenderedPageBreak/>
-        <w:t xml:space="preserve">pomohlo zvýšit obrat. Prodavač uposlechne </w:t>
+        <w:t xml:space="preserve">sklenice, až ho napadne, že by v nich mohli kolemjdoucím podávat osvěžující čaj. Nejen že by tím lidi přilákali, ale navíc by si lidé jistě všimli, jak krásně čaj ve skle vypadá a sklenáři by to pomohlo zvýšit obrat. Prodavač uposlechne </w:t>
       </w:r>
       <w:proofErr w:type="spellStart"/>
       <w:r>
@@ -432,7 +468,15 @@
       </w:r>
       <w:proofErr w:type="spellEnd"/>
       <w:r>
-        <w:t xml:space="preserve"> rady a zanedlouho se jeho krámek stane vyhlášeným. Santiago navíc rychleji získává peníze potřebné k návratu do Španělska a ke koupi stáda ovcí. Nakonec však mění své rozhodnutí a jde dál za svým snem. Kupuje si velblouda a přidává se ke karavaně mířící k pyramidám. Cestou se seznamuje s životem pouště a se znameními, které duny písku člověku poskytují, pokud se on dobře dívá. Také poznává Angličana, který putuje do pouštní oázy neboť se dozvěděl o velmi starém Alchymistovi, který tam žije a který by mu mohl prozradit tajemství o přeměně železa ve zlato – cílové metě všech alchymistů. Při cestě však vypukne válka mezi pouštními kmeny a karavana se musí po dobu jejího trvání uchýlit do bezpečí oázy, která má statut neutrálního území. Santiago zde potkává arabskou dívku </w:t>
+        <w:t xml:space="preserve"> rady a zanedlouho se jeho krámek stane vyhlášeným. Santiago navíc rychleji získává peníze potřebné k návratu do Španělska a ke koupi stáda ovcí. Nakonec však mění své rozhodnutí a jde dál za svým snem. Kupuje si velblouda a přidává se ke karavaně mířící k pyramidám. Cestou se seznamuje s životem pouště a se znameními, které duny písku člověku poskytují, pokud se on dobře dívá. Také poznává Angličana, který putuje do pouštní </w:t>
+      </w:r>
+      <w:proofErr w:type="gramStart"/>
+      <w:r>
+        <w:t>oázy</w:t>
+      </w:r>
+      <w:proofErr w:type="gramEnd"/>
+      <w:r>
+        <w:t xml:space="preserve"> neboť se dozvěděl o velmi starém Alchymistovi, který tam žije a který by mu mohl prozradit tajemství o přeměně železa ve zlato – cílové metě všech alchymistů. Při cestě však vypukne válka mezi pouštními kmeny a karavana se musí po dobu jejího trvání uchýlit do bezpečí oázy, která má statut neutrálního území. Santiago zde potkává arabskou dívku </w:t>
       </w:r>
       <w:proofErr w:type="spellStart"/>
       <w:r>
@@ -453,7 +497,15 @@
       </w:r>
       <w:proofErr w:type="spellEnd"/>
       <w:r>
-        <w:t xml:space="preserve">, nemá co na práci. Začne se více věnovat dění v poušti, studuje její chod a život. Přitom si jednou všimne zvláštního letu dvou krahujců. Náhle se mu v jediné chvilince objeví před očima obraz napadené oázy. Uvědomuje si, že toto znamení nemusí být pravdou, ale přesto sdělí svou vidinu kmenovým vůdcům oázy. Oni jako muži pouště jsou zvyklí sledovat její znamení, jen jim není jasné, proč by je měl vidět také neznámý cizinec. Navíc v oázách se kmeny navzájem nenapadají. Nakonec se rozhodnou údajnému nebezpečí čelit, avšak v případě, že jejich zbraně nepromluví, přijde o život sám Santiago….Kráčel tiše. Ničeho nelitoval. Zemře-li zítra, bude to proto, že Bůh nechce budoucnost změnit. Zemře však až poté, co se přeplavil přes průliv, co pracoval ve sklenářství, poznal mlčení pouště a oči </w:t>
+        <w:t xml:space="preserve">, </w:t>
+      </w:r>
+      <w:proofErr w:type="gramStart"/>
+      <w:r>
+        <w:t>nemá</w:t>
+      </w:r>
+      <w:proofErr w:type="gramEnd"/>
+      <w:r>
+        <w:t xml:space="preserve"> co na práci. Začne se více věnovat dění v poušti, studuje její chod a život. Přitom si jednou všimne zvláštního letu dvou krahujců. Náhle se mu v jediné chvilince objeví před očima obraz napadené oázy. Uvědomuje si, že toto znamení nemusí být pravdou, ale přesto sdělí svou vidinu kmenovým vůdcům oázy. Oni jako muži pouště jsou zvyklí sledovat její znamení, jen jim není jasné, proč by je měl vidět také neznámý cizinec. Navíc v oázách se kmeny navzájem nenapadají. Nakonec se rozhodnou údajnému nebezpečí čelit, avšak v případě, že jejich zbraně nepromluví, přijde o život sám Santiago….Kráčel tiše. Ničeho nelitoval. Zemře-li zítra, bude to proto, že Bůh nechce budoucnost změnit. Zemře však až poté, co se přeplavil přes průliv, co pracoval ve sklenářství, poznal mlčení pouště a oči </w:t>
       </w:r>
       <w:proofErr w:type="spellStart"/>
       <w:r>
@@ -478,7 +530,15 @@
         <w:t>vysvětlit,</w:t>
       </w:r>
       <w:r>
-        <w:t xml:space="preserve"> a přitom jim sdělí, že Santiago se umí proměnit ve vítr. Bojovníci jsou překvapeni a zároveň ochotni je propustit, pokud jim přeměnu předvedou. Santiago je zděšen – on se přeci ve vítr proměnit neumí. Celý den medituje v pouštní samotě. Večer před shromážděným kmenem prosí o pomoc poušť, vítr i slunce. Zvedá se obrovská bouře, která celé okolí zahalí. V momentu, kdy se vítr utiší, Santiago stojí na druhém konci tábora. Oba tedy mohou pokračovat dále. Těsně před pyramidami Alchymista hocha opouští a ten jde sám až na místo skrytého pokladu. Marně však celou noc kope. Právě když se chtěl dát znovu do kopání přepadnou ho tři Arabové a chtějí po něm zlato. Na pokraji svých sil jim Santiago poví o svém snu a oni ho nechají, protože jednomu z nich se právě na tomto místě zdál dvakrát stejný sen o pokladu, zakopaném ve Španělsku…Santiago namáhavě vstal a ještě jednou pohlédl k pyramidám. Pyramidy se na něho usmály a on se srdcem plným štěstí jim ten úsměv oplatil. Našel poklad, protože Santiago pochopí, že poklad nalezne tedy doma, vyzvedne si u mnicha kus zlata na cestu, doma nalezne v kostelíku poklad, desátek odevzdá cikánce a vrátí se do oázy pro svou </w:t>
+        <w:t xml:space="preserve"> a přitom jim sdělí, že Santiago se umí proměnit ve vítr. Bojovníci jsou překvapeni a zároveň ochotni je propustit, pokud jim přeměnu předvedou. Santiago je zděšen – on se přeci ve vítr proměnit neumí. Celý den medituje v pouštní samotě. Večer před shromážděným kmenem prosí o pomoc poušť, vítr i slunce. Zvedá se obrovská bouře, která celé okolí zahalí. V momentu, kdy se vítr utiší, Santiago stojí na druhém konci tábora. Oba tedy mohou pokračovat dále. Těsně před pyramidami Alchymista hocha opouští a ten jde sám až na místo skrytého pokladu. Marně však celou noc kope. Právě když se chtěl dát znovu do kopání přepadnou ho tři Arabové a chtějí po něm zlato. Na pokraji svých sil jim Santiago poví o svém snu a oni ho nechají, protože jednomu z nich se právě na tomto místě zdál dvakrát stejný sen o pokladu, zakopaném ve Španělsku…Santiago namáhavě </w:t>
+      </w:r>
+      <w:proofErr w:type="gramStart"/>
+      <w:r>
+        <w:t>vstal</w:t>
+      </w:r>
+      <w:proofErr w:type="gramEnd"/>
+      <w:r>
+        <w:t xml:space="preserve"> a ještě jednou pohlédl k pyramidám. Pyramidy se na něho usmály a on se srdcem plným štěstí jim ten úsměv oplatil. Našel poklad, protože Santiago pochopí, že poklad nalezne tedy doma, vyzvedne si u mnicha kus zlata na cestu, doma nalezne v kostelíku poklad, desátek odevzdá cikánce a vrátí se do oázy pro svou </w:t>
       </w:r>
       <w:proofErr w:type="spellStart"/>
       <w:r>
@@ -613,8 +673,124 @@
       </w:rPr>
     </w:lvl>
   </w:abstractNum>
+  <w:abstractNum w:abstractNumId="1" w15:restartNumberingAfterBreak="0">
+    <w:nsid w:val="40A52B77"/>
+    <w:multiLevelType w:val="hybridMultilevel"/>
+    <w:tmpl w:val="D93A061C"/>
+    <w:lvl w:ilvl="0" w:tplc="0CF6A5BE">
+      <w:numFmt w:val="bullet"/>
+      <w:lvlText w:val="-"/>
+      <w:lvlJc w:val="left"/>
+      <w:pPr>
+        <w:ind w:left="720" w:hanging="360"/>
+      </w:pPr>
+      <w:rPr>
+        <w:rFonts w:ascii="Aptos" w:eastAsiaTheme="minorHAnsi" w:hAnsi="Aptos" w:cstheme="minorBidi" w:hint="default"/>
+        <w:b/>
+      </w:rPr>
+    </w:lvl>
+    <w:lvl w:ilvl="1" w:tplc="04050003" w:tentative="1">
+      <w:start w:val="1"/>
+      <w:numFmt w:val="bullet"/>
+      <w:lvlText w:val="o"/>
+      <w:lvlJc w:val="left"/>
+      <w:pPr>
+        <w:ind w:left="1440" w:hanging="360"/>
+      </w:pPr>
+      <w:rPr>
+        <w:rFonts w:ascii="Courier New" w:hAnsi="Courier New" w:cs="Courier New" w:hint="default"/>
+      </w:rPr>
+    </w:lvl>
+    <w:lvl w:ilvl="2" w:tplc="04050005" w:tentative="1">
+      <w:start w:val="1"/>
+      <w:numFmt w:val="bullet"/>
+      <w:lvlText w:val=""/>
+      <w:lvlJc w:val="left"/>
+      <w:pPr>
+        <w:ind w:left="2160" w:hanging="360"/>
+      </w:pPr>
+      <w:rPr>
+        <w:rFonts w:ascii="Wingdings" w:hAnsi="Wingdings" w:hint="default"/>
+      </w:rPr>
+    </w:lvl>
+    <w:lvl w:ilvl="3" w:tplc="04050001" w:tentative="1">
+      <w:start w:val="1"/>
+      <w:numFmt w:val="bullet"/>
+      <w:lvlText w:val=""/>
+      <w:lvlJc w:val="left"/>
+      <w:pPr>
+        <w:ind w:left="2880" w:hanging="360"/>
+      </w:pPr>
+      <w:rPr>
+        <w:rFonts w:ascii="Symbol" w:hAnsi="Symbol" w:hint="default"/>
+      </w:rPr>
+    </w:lvl>
+    <w:lvl w:ilvl="4" w:tplc="04050003" w:tentative="1">
+      <w:start w:val="1"/>
+      <w:numFmt w:val="bullet"/>
+      <w:lvlText w:val="o"/>
+      <w:lvlJc w:val="left"/>
+      <w:pPr>
+        <w:ind w:left="3600" w:hanging="360"/>
+      </w:pPr>
+      <w:rPr>
+        <w:rFonts w:ascii="Courier New" w:hAnsi="Courier New" w:cs="Courier New" w:hint="default"/>
+      </w:rPr>
+    </w:lvl>
+    <w:lvl w:ilvl="5" w:tplc="04050005" w:tentative="1">
+      <w:start w:val="1"/>
+      <w:numFmt w:val="bullet"/>
+      <w:lvlText w:val=""/>
+      <w:lvlJc w:val="left"/>
+      <w:pPr>
+        <w:ind w:left="4320" w:hanging="360"/>
+      </w:pPr>
+      <w:rPr>
+        <w:rFonts w:ascii="Wingdings" w:hAnsi="Wingdings" w:hint="default"/>
+      </w:rPr>
+    </w:lvl>
+    <w:lvl w:ilvl="6" w:tplc="04050001" w:tentative="1">
+      <w:start w:val="1"/>
+      <w:numFmt w:val="bullet"/>
+      <w:lvlText w:val=""/>
+      <w:lvlJc w:val="left"/>
+      <w:pPr>
+        <w:ind w:left="5040" w:hanging="360"/>
+      </w:pPr>
+      <w:rPr>
+        <w:rFonts w:ascii="Symbol" w:hAnsi="Symbol" w:hint="default"/>
+      </w:rPr>
+    </w:lvl>
+    <w:lvl w:ilvl="7" w:tplc="04050003" w:tentative="1">
+      <w:start w:val="1"/>
+      <w:numFmt w:val="bullet"/>
+      <w:lvlText w:val="o"/>
+      <w:lvlJc w:val="left"/>
+      <w:pPr>
+        <w:ind w:left="5760" w:hanging="360"/>
+      </w:pPr>
+      <w:rPr>
+        <w:rFonts w:ascii="Courier New" w:hAnsi="Courier New" w:cs="Courier New" w:hint="default"/>
+      </w:rPr>
+    </w:lvl>
+    <w:lvl w:ilvl="8" w:tplc="04050005" w:tentative="1">
+      <w:start w:val="1"/>
+      <w:numFmt w:val="bullet"/>
+      <w:lvlText w:val=""/>
+      <w:lvlJc w:val="left"/>
+      <w:pPr>
+        <w:ind w:left="6480" w:hanging="360"/>
+      </w:pPr>
+      <w:rPr>
+        <w:rFonts w:ascii="Wingdings" w:hAnsi="Wingdings" w:hint="default"/>
+      </w:rPr>
+    </w:lvl>
+  </w:abstractNum>
   <w:num w:numId="1" w16cid:durableId="1400784327">
     <w:abstractNumId w:val="0"/>
+  </w:num>
+  <w:num w:numId="2" w16cid:durableId="862523716">
+    <w:abstractNumId w:val="1"/>
   </w:num>
 </w:numbering>
 </file>

</xml_diff>